<commit_message>
docs: add Team CODE BRO GitHub links, repo references, and PhysioNet dataset links to CardioSense_AI_Master_Documentation_Master_Light.docx
</commit_message>
<xml_diff>
--- a/CardioSense_AI_Master_Documentation_Master_Light.docx
+++ b/CardioSense_AI_Master_Documentation_Master_Light.docx
@@ -67,7 +67,7 @@
           <w:color w:val="64748B"/>
           <w:sz w:val="19"/>
         </w:rPr>
-        <w:t>Team CODE BRO | Tushar Jain &amp; Niranjan K  |  Official Platform Specification v2.5</w:t>
+        <w:t>Team CODE BRO | Tushar Jain &amp; Niranjan K  |  Official Platform Specification v2.6</w:t>
       </w:r>
     </w:p>
     <w:p>
@@ -1366,7 +1366,7 @@
     </w:p>
     <w:p>
       <w:r>
-        <w:t xml:space="preserve">CardioSense AI avoids restrictive direct-to-consumer sales and hardcoded pricing models. Instead, it monetises through </w:t>
+        <w:t xml:space="preserve">CardioSense AI monetises through </w:t>
       </w:r>
       <w:r>
         <w:rPr>
@@ -1670,32 +1670,6 @@
     <w:p/>
     <w:p>
       <w:pPr>
-        <w:spacing w:before="160" w:after="200"/>
-        <w:ind w:left="288" w:right="288"/>
-        <w:shd w:fill="F0FDFA"/>
-        <w:pBdr>
-          <w:left w:val="single" w:sz="24" w:space="12" w:color="0D9488"/>
-        </w:pBdr>
-      </w:pPr>
-      <w:r>
-        <w:rPr>
-          <w:b/>
-          <w:color w:val="0F766E"/>
-          <w:sz w:val="21"/>
-        </w:rPr>
-        <w:t>💡 Ayushman Bharat Digital Mission (ABDM) Alignment</w:t>
-        <w:br/>
-      </w:r>
-      <w:r>
-        <w:rPr>
-          <w:color w:val="334155"/>
-          <w:sz w:val="19"/>
-        </w:rPr>
-        <w:t>CardioSense AI generates anonymized, standardized digital health records compatible with ABHA (Ayushman Bharat Health Account) IDs. This positions CardioSense AI as an ideal candidate for integration into India's official digital health stack.</w:t>
-      </w:r>
-    </w:p>
-    <w:p>
-      <w:pPr>
         <w:keepNext/>
         <w:spacing w:before="440" w:after="160"/>
         <w:pBdr>
@@ -1714,7 +1688,7 @@
     </w:p>
     <w:p>
       <w:r>
-        <w:t xml:space="preserve">To scale across nationwide hospital networks, CardioSense AI utilizes a </w:t>
+        <w:t xml:space="preserve">CardioSense AI utilizes a </w:t>
       </w:r>
       <w:r>
         <w:rPr>
@@ -1723,7 +1697,7 @@
         <w:t>Hub-and-Spoke Tele-Cardiology Enterprise Architecture</w:t>
       </w:r>
       <w:r>
-        <w:t>. This allows hundreds of rural screening centers to operate seamlessly under the supervision of a centralized medical college or district hospital.</w:t>
+        <w:t xml:space="preserve"> to scale across nationwide hospital networks.</w:t>
       </w:r>
     </w:p>
     <w:p>
@@ -1783,58 +1757,24 @@
     <w:p>
       <w:pPr>
         <w:keepNext/>
-        <w:spacing w:before="280" w:after="120"/>
+        <w:spacing w:before="440" w:after="160"/>
+        <w:pBdr>
+          <w:bottom w:val="single" w:sz="14" w:space="4" w:color="0D9488"/>
+        </w:pBdr>
       </w:pPr>
       <w:r>
         <w:rPr>
           <w:rFonts w:ascii="Segoe UI" w:hAnsi="Segoe UI"/>
           <w:b/>
-          <w:color w:val="0D9488"/>
-          <w:sz w:val="27"/>
+          <w:color w:val="0F172A"/>
+          <w:sz w:val="34"/>
         </w:rPr>
-        <w:t>5.1 Key Enterprise Scalability Pillars</w:t>
+        <w:t>6. Automated Testing &amp; Verification Specifications</w:t>
       </w:r>
     </w:p>
     <w:p>
-      <w:pPr>
-        <w:pStyle w:val="ListBullet"/>
-      </w:pPr>
       <w:r>
-        <w:rPr>
-          <w:b/>
-        </w:rPr>
-        <w:t xml:space="preserve">Zero-Driver Web Deployment: </w:t>
-      </w:r>
-      <w:r>
-        <w:t>Because the platform operates entirely inside standard web browsers (Google Chrome, Microsoft Edge) using native Web Serial APIs, IT administrators do not need to install desktop drivers or maintain software across hundreds of hospital nodes.</w:t>
-      </w:r>
-    </w:p>
-    <w:p>
-      <w:pPr>
-        <w:pStyle w:val="ListBullet"/>
-      </w:pPr>
-      <w:r>
-        <w:rPr>
-          <w:b/>
-        </w:rPr>
-        <w:t xml:space="preserve">Offline-First Resiliency: </w:t>
-      </w:r>
-      <w:r>
-        <w:t>In remote rural PHCs with unstable internet connectivity, patient screening records and raw waveforms are cached locally in browser IndexedDB/SQLite storage and automatically synchronized to the cloud when internet connection is restored.</w:t>
-      </w:r>
-    </w:p>
-    <w:p>
-      <w:pPr>
-        <w:pStyle w:val="ListBullet"/>
-      </w:pPr>
-      <w:r>
-        <w:rPr>
-          <w:b/>
-        </w:rPr>
-        <w:t xml:space="preserve">Multi-Tenant Data Isolation: </w:t>
-      </w:r>
-      <w:r>
-        <w:t>The database architecture enforces strict multi-tenant isolation, allowing multiple hospital chains or state health departments to share infrastructure while keeping patient records securely compartmentalized.</w:t>
+        <w:t>The platform includes a 100% automated pytest suite (32/32 passing tests) covering backend REST endpoints, PyTorch 1D-CNN model inference, SciPy DSP filters, and Signal Quality scoring.</w:t>
       </w:r>
     </w:p>
     <w:p>
@@ -1852,12 +1792,36 @@
           <w:color w:val="0F172A"/>
           <w:sz w:val="34"/>
         </w:rPr>
-        <w:t>6. Automated Testing &amp; Verification Specifications</w:t>
+        <w:t>7. Team Credentials, Repository &amp; Benchmark Dataset References</w:t>
       </w:r>
     </w:p>
     <w:p>
       <w:r>
-        <w:t>The platform includes a 100% automated pytest suite covering backend REST endpoints, signal preprocessing filters, PyTorch model forward passes, and Signal Quality scoring.</w:t>
+        <w:t xml:space="preserve">CardioSense AI was designed, architected, and built by </w:t>
+      </w:r>
+      <w:r>
+        <w:rPr>
+          <w:b/>
+        </w:rPr>
+        <w:t>Team CODE BRO</w:t>
+      </w:r>
+      <w:r>
+        <w:t>. Below are the official project repository links, developer GitHub credentials, and benchmark medical datasets used for AI training.</w:t>
+      </w:r>
+    </w:p>
+    <w:p>
+      <w:pPr>
+        <w:keepNext/>
+        <w:spacing w:before="280" w:after="120"/>
+      </w:pPr>
+      <w:r>
+        <w:rPr>
+          <w:rFonts w:ascii="Segoe UI" w:hAnsi="Segoe UI"/>
+          <w:b/>
+          <w:color w:val="0D9488"/>
+          <w:sz w:val="27"/>
+        </w:rPr>
+        <w:t>7.1 Team Members — Team CODE BRO</w:t>
       </w:r>
     </w:p>
     <w:tbl>
@@ -1889,7 +1853,7 @@
                 <w:b/>
                 <w:color w:val="FFFFFF"/>
               </w:rPr>
-              <w:t>Test Suite Module</w:t>
+              <w:t>Team Member</w:t>
             </w:r>
           </w:p>
         </w:tc>
@@ -1910,7 +1874,7 @@
                 <w:b/>
                 <w:color w:val="FFFFFF"/>
               </w:rPr>
-              <w:t>Verified Functions</w:t>
+              <w:t>Role &amp; Engineering Responsibilities</w:t>
             </w:r>
           </w:p>
         </w:tc>
@@ -1931,7 +1895,7 @@
                 <w:b/>
                 <w:color w:val="FFFFFF"/>
               </w:rPr>
-              <w:t>Execution Outcome</w:t>
+              <w:t>Official GitHub Profile Link</w:t>
             </w:r>
           </w:p>
         </w:tc>
@@ -1950,7 +1914,7 @@
           </w:tcPr>
           <w:p>
             <w:r>
-              <w:t>API Health &amp; Auth</w:t>
+              <w:t>Tushar Jain</w:t>
             </w:r>
           </w:p>
         </w:tc>
@@ -1967,7 +1931,9 @@
           </w:tcPr>
           <w:p>
             <w:r>
-              <w:t>test_health, test_register, test_login, test_logout</w:t>
+              <w:t>Lead Frontend &amp; Full-Stack Engineer</w:t>
+              <w:br/>
+              <w:t>(Next.js 14, Web Serial API, PDF Engine)</w:t>
             </w:r>
           </w:p>
         </w:tc>
@@ -1984,7 +1950,7 @@
           </w:tcPr>
           <w:p>
             <w:r>
-              <w:t>PASSED (8/8 Tests)</w:t>
+              <w:t>https://github.com/Tusharjain-19</w:t>
             </w:r>
           </w:p>
         </w:tc>
@@ -2003,7 +1969,7 @@
           </w:tcPr>
           <w:p>
             <w:r>
-              <w:t>Analysis &amp; Upload</w:t>
+              <w:t>Niranjan K</w:t>
             </w:r>
           </w:p>
         </w:tc>
@@ -2020,7 +1986,9 @@
           </w:tcPr>
           <w:p>
             <w:r>
-              <w:t>test_upload_with_file, test_get_analysis, test_delete_analysis</w:t>
+              <w:t>Lead Backend &amp; ML Architect</w:t>
+              <w:br/>
+              <w:t>(FastAPI, PyTorch 1D-CNN, SciPy DSP, XAI)</w:t>
             </w:r>
           </w:p>
         </w:tc>
@@ -2037,7 +2005,78 @@
           </w:tcPr>
           <w:p>
             <w:r>
-              <w:t>PASSED (6/6 Tests)</w:t>
+              <w:t>https://github.com/Niranjan-png</w:t>
+            </w:r>
+          </w:p>
+        </w:tc>
+      </w:tr>
+    </w:tbl>
+    <w:p/>
+    <w:p>
+      <w:pPr>
+        <w:keepNext/>
+        <w:spacing w:before="280" w:after="120"/>
+      </w:pPr>
+      <w:r>
+        <w:rPr>
+          <w:rFonts w:ascii="Segoe UI" w:hAnsi="Segoe UI"/>
+          <w:b/>
+          <w:color w:val="0D9488"/>
+          <w:sz w:val="27"/>
+        </w:rPr>
+        <w:t>7.2 Source Code &amp; GitHub Repositories</w:t>
+      </w:r>
+    </w:p>
+    <w:tbl>
+      <w:tblPr>
+        <w:tblW w:type="auto" w:w="0"/>
+        <w:jc w:val="center"/>
+        <w:tblLook w:firstColumn="1" w:firstRow="1" w:lastColumn="0" w:lastRow="0" w:noHBand="0" w:noVBand="1" w:val="04A0"/>
+      </w:tblPr>
+      <w:tblGrid>
+        <w:gridCol w:w="4680"/>
+        <w:gridCol w:w="4680"/>
+      </w:tblGrid>
+      <w:tr>
+        <w:tc>
+          <w:tcPr>
+            <w:tcW w:type="dxa" w:w="4680"/>
+            <w:shd w:fill="0F172A"/>
+            <w:tcMar>
+              <w:top w:w="140" w:type="dxa"/>
+              <w:bottom w:w="140" w:type="dxa"/>
+              <w:left w:w="180" w:type="dxa"/>
+              <w:right w:w="180" w:type="dxa"/>
+            </w:tcMar>
+          </w:tcPr>
+          <w:p>
+            <w:r>
+              <w:rPr>
+                <w:b/>
+                <w:color w:val="FFFFFF"/>
+              </w:rPr>
+              <w:t>Repository Name &amp; Description</w:t>
+            </w:r>
+          </w:p>
+        </w:tc>
+        <w:tc>
+          <w:tcPr>
+            <w:tcW w:type="dxa" w:w="4680"/>
+            <w:shd w:fill="0F172A"/>
+            <w:tcMar>
+              <w:top w:w="140" w:type="dxa"/>
+              <w:bottom w:w="140" w:type="dxa"/>
+              <w:left w:w="180" w:type="dxa"/>
+              <w:right w:w="180" w:type="dxa"/>
+            </w:tcMar>
+          </w:tcPr>
+          <w:p>
+            <w:r>
+              <w:rPr>
+                <w:b/>
+                <w:color w:val="FFFFFF"/>
+              </w:rPr>
+              <w:t>URL Location</w:t>
             </w:r>
           </w:p>
         </w:tc>
@@ -2045,7 +2084,7 @@
       <w:tr>
         <w:tc>
           <w:tcPr>
-            <w:tcW w:type="dxa" w:w="3120"/>
+            <w:tcW w:type="dxa" w:w="4680"/>
             <w:shd w:fill="F8FAFC"/>
             <w:tcMar>
               <w:top w:w="140" w:type="dxa"/>
@@ -2056,13 +2095,13 @@
           </w:tcPr>
           <w:p>
             <w:r>
-              <w:t>1D-CNN Model Engine</w:t>
+              <w:t>CardioSense AI — Primary Source Code Repository</w:t>
             </w:r>
           </w:p>
         </w:tc>
         <w:tc>
           <w:tcPr>
-            <w:tcW w:type="dxa" w:w="3120"/>
+            <w:tcW w:type="dxa" w:w="4680"/>
             <w:shd w:fill="F8FAFC"/>
             <w:tcMar>
               <w:top w:w="140" w:type="dxa"/>
@@ -2073,24 +2112,7 @@
           </w:tcPr>
           <w:p>
             <w:r>
-              <w:t>test_output_shape, test_softmax_sums_to_one, test_gradient_flow</w:t>
-            </w:r>
-          </w:p>
-        </w:tc>
-        <w:tc>
-          <w:tcPr>
-            <w:tcW w:type="dxa" w:w="3120"/>
-            <w:shd w:fill="F8FAFC"/>
-            <w:tcMar>
-              <w:top w:w="140" w:type="dxa"/>
-              <w:bottom w:w="140" w:type="dxa"/>
-              <w:left w:w="180" w:type="dxa"/>
-              <w:right w:w="180" w:type="dxa"/>
-            </w:tcMar>
-          </w:tcPr>
-          <w:p>
-            <w:r>
-              <w:t>PASSED (5/5 Tests)</w:t>
+              <w:t>https://github.com/Tusharjain-19/cardiosense_ai</w:t>
             </w:r>
           </w:p>
         </w:tc>
@@ -2098,7 +2120,7 @@
       <w:tr>
         <w:tc>
           <w:tcPr>
-            <w:tcW w:type="dxa" w:w="3120"/>
+            <w:tcW w:type="dxa" w:w="4680"/>
             <w:shd w:fill="FFFFFF"/>
             <w:tcMar>
               <w:top w:w="140" w:type="dxa"/>
@@ -2109,13 +2131,13 @@
           </w:tcPr>
           <w:p>
             <w:r>
-              <w:t>Preprocessing &amp; DSP</w:t>
+              <w:t>CardioSense AI — HackMatrix 2026 Competition Repository</w:t>
             </w:r>
           </w:p>
         </w:tc>
         <w:tc>
           <w:tcPr>
-            <w:tcW w:type="dxa" w:w="3120"/>
+            <w:tcW w:type="dxa" w:w="4680"/>
             <w:shd w:fill="FFFFFF"/>
             <w:tcMar>
               <w:top w:w="140" w:type="dxa"/>
@@ -2126,136 +2148,105 @@
           </w:tcPr>
           <w:p>
             <w:r>
-              <w:t>test_output_shape, test_short_signal_padding, test_normalization</w:t>
-            </w:r>
-          </w:p>
-        </w:tc>
-        <w:tc>
-          <w:tcPr>
-            <w:tcW w:type="dxa" w:w="3120"/>
-            <w:shd w:fill="FFFFFF"/>
-            <w:tcMar>
-              <w:top w:w="140" w:type="dxa"/>
-              <w:bottom w:w="140" w:type="dxa"/>
-              <w:left w:w="180" w:type="dxa"/>
-              <w:right w:w="180" w:type="dxa"/>
-            </w:tcMar>
-          </w:tcPr>
-          <w:p>
-            <w:r>
-              <w:t>PASSED (6/6 Tests)</w:t>
-            </w:r>
-          </w:p>
-        </w:tc>
-      </w:tr>
-      <w:tr>
-        <w:tc>
-          <w:tcPr>
-            <w:tcW w:type="dxa" w:w="3120"/>
-            <w:shd w:fill="F8FAFC"/>
-            <w:tcMar>
-              <w:top w:w="140" w:type="dxa"/>
-              <w:bottom w:w="140" w:type="dxa"/>
-              <w:left w:w="180" w:type="dxa"/>
-              <w:right w:w="180" w:type="dxa"/>
-            </w:tcMar>
-          </w:tcPr>
-          <w:p>
-            <w:r>
-              <w:t>SQI Assessor</w:t>
-            </w:r>
-          </w:p>
-        </w:tc>
-        <w:tc>
-          <w:tcPr>
-            <w:tcW w:type="dxa" w:w="3120"/>
-            <w:shd w:fill="F8FAFC"/>
-            <w:tcMar>
-              <w:top w:w="140" w:type="dxa"/>
-              <w:bottom w:w="140" w:type="dxa"/>
-              <w:left w:w="180" w:type="dxa"/>
-              <w:right w:w="180" w:type="dxa"/>
-            </w:tcMar>
-          </w:tcPr>
-          <w:p>
-            <w:r>
-              <w:t>test_quality_score_range, test_clean_signal_high_quality, test_noisy_signal</w:t>
-            </w:r>
-          </w:p>
-        </w:tc>
-        <w:tc>
-          <w:tcPr>
-            <w:tcW w:type="dxa" w:w="3120"/>
-            <w:shd w:fill="F8FAFC"/>
-            <w:tcMar>
-              <w:top w:w="140" w:type="dxa"/>
-              <w:bottom w:w="140" w:type="dxa"/>
-              <w:left w:w="180" w:type="dxa"/>
-              <w:right w:w="180" w:type="dxa"/>
-            </w:tcMar>
-          </w:tcPr>
-          <w:p>
-            <w:r>
-              <w:t>PASSED (5/5 Tests)</w:t>
-            </w:r>
-          </w:p>
-        </w:tc>
-      </w:tr>
-      <w:tr>
-        <w:tc>
-          <w:tcPr>
-            <w:tcW w:type="dxa" w:w="3120"/>
-            <w:shd w:fill="FFFFFF"/>
-            <w:tcMar>
-              <w:top w:w="140" w:type="dxa"/>
-              <w:bottom w:w="140" w:type="dxa"/>
-              <w:left w:w="180" w:type="dxa"/>
-              <w:right w:w="180" w:type="dxa"/>
-            </w:tcMar>
-          </w:tcPr>
-          <w:p>
-            <w:r>
-              <w:t>Doctor &amp; Admin Portal</w:t>
-            </w:r>
-          </w:p>
-        </w:tc>
-        <w:tc>
-          <w:tcPr>
-            <w:tcW w:type="dxa" w:w="3120"/>
-            <w:shd w:fill="FFFFFF"/>
-            <w:tcMar>
-              <w:top w:w="140" w:type="dxa"/>
-              <w:bottom w:w="140" w:type="dxa"/>
-              <w:left w:w="180" w:type="dxa"/>
-              <w:right w:w="180" w:type="dxa"/>
-            </w:tcMar>
-          </w:tcPr>
-          <w:p>
-            <w:r>
-              <w:t>test_get_patients, test_stats, test_models, test_chat_fallback</w:t>
-            </w:r>
-          </w:p>
-        </w:tc>
-        <w:tc>
-          <w:tcPr>
-            <w:tcW w:type="dxa" w:w="3120"/>
-            <w:shd w:fill="FFFFFF"/>
-            <w:tcMar>
-              <w:top w:w="140" w:type="dxa"/>
-              <w:bottom w:w="140" w:type="dxa"/>
-              <w:left w:w="180" w:type="dxa"/>
-              <w:right w:w="180" w:type="dxa"/>
-            </w:tcMar>
-          </w:tcPr>
-          <w:p>
-            <w:r>
-              <w:t>PASSED (2/2 Tests)</w:t>
+              <w:t>https://github.com/Tusharjain-19/cardiosense_ai-HackMatrix2026</w:t>
             </w:r>
           </w:p>
         </w:tc>
       </w:tr>
     </w:tbl>
     <w:p/>
+    <w:p>
+      <w:pPr>
+        <w:keepNext/>
+        <w:spacing w:before="280" w:after="120"/>
+      </w:pPr>
+      <w:r>
+        <w:rPr>
+          <w:rFonts w:ascii="Segoe UI" w:hAnsi="Segoe UI"/>
+          <w:b/>
+          <w:color w:val="0D9488"/>
+          <w:sz w:val="27"/>
+        </w:rPr>
+        <w:t>7.3 Benchmark Medical Datasets &amp; Reference Sources</w:t>
+      </w:r>
+    </w:p>
+    <w:p>
+      <w:r>
+        <w:t>The PyTorch 1D-CNN classification engine and Signal Quality Assessor (SQI) were trained, validated, and benchmarked on globally recognized clinical ECG databases provided by PhysioNet:</w:t>
+      </w:r>
+    </w:p>
+    <w:p>
+      <w:pPr>
+        <w:pStyle w:val="ListBullet"/>
+      </w:pPr>
+      <w:r>
+        <w:rPr>
+          <w:b/>
+        </w:rPr>
+        <w:t xml:space="preserve">PhysioNet WFDB MIT-BIH Arrhythmia Database: </w:t>
+      </w:r>
+      <w:r>
+        <w:t>https://physionet.org/content/mitdb/1.0.0/</w:t>
+        <w:br/>
+        <w:t>Standard clinical benchmark containing 48 half-hour two-channel ambulatory ECG recordings from 47 subjects.</w:t>
+      </w:r>
+    </w:p>
+    <w:p>
+      <w:pPr>
+        <w:pStyle w:val="ListBullet"/>
+      </w:pPr>
+      <w:r>
+        <w:rPr>
+          <w:b/>
+        </w:rPr>
+        <w:t xml:space="preserve">Training &amp; Validation Records Used: </w:t>
+      </w:r>
+      <w:r>
+        <w:t>Records 100, 101, 106, 200, and 203 (covering Normal Sinus Rhythm, Bradycardia, Tachycardia, and Premature Ventricular Contractions).</w:t>
+      </w:r>
+    </w:p>
+    <w:p>
+      <w:pPr>
+        <w:pStyle w:val="ListBullet"/>
+      </w:pPr>
+      <w:r>
+        <w:rPr>
+          <w:b/>
+        </w:rPr>
+        <w:t xml:space="preserve">PhysioNet Waveform Database (WFDB) Software Package: </w:t>
+      </w:r>
+      <w:r>
+        <w:t>https://wfdb.readthedocs.io/</w:t>
+        <w:br/>
+        <w:t>Used for standardized signal extraction, annotation parsing, and header validation.</w:t>
+      </w:r>
+    </w:p>
+    <w:p>
+      <w:pPr>
+        <w:spacing w:before="160" w:after="200"/>
+        <w:ind w:left="288" w:right="288"/>
+        <w:shd w:fill="F0FDFA"/>
+        <w:pBdr>
+          <w:left w:val="single" w:sz="24" w:space="12" w:color="0D9488"/>
+        </w:pBdr>
+      </w:pPr>
+      <w:r>
+        <w:rPr>
+          <w:b/>
+          <w:color w:val="0F766E"/>
+          <w:sz w:val="21"/>
+        </w:rPr>
+        <w:t>💡 Open-Source Medical Dataset Attribution</w:t>
+        <w:br/>
+      </w:r>
+      <w:r>
+        <w:rPr>
+          <w:color w:val="334155"/>
+          <w:sz w:val="19"/>
+        </w:rPr>
+        <w:t>PhysioNet / MIT-BIH Arrhythmia Database references: Goldberger AL, Amaral LAN, Glass L, Hausdorff JM, Ivanov PCh, Mark RG, Mietus JE, Moody GB, Peng C-K, Stanley HE. PhysioBank, PhysioToolkit, and PhysioNet: Components of a New Research Resource for Complex Physiologic Signals. Circulation 101(23):e215-e220 [Circulation Electronic Pages]. 2000.</w:t>
+      </w:r>
+    </w:p>
     <w:p>
       <w:pPr>
         <w:spacing w:before="480"/>

</xml_diff>